<commit_message>
Update ignored development files
</commit_message>
<xml_diff>
--- a/REPORT.docx
+++ b/REPORT.docx
@@ -32,8 +32,6 @@
       </w:r>
     </w:p>
     <w:p>
-      <w:bookmarkStart w:id="0" w:name="_GoBack"/>
-      <w:bookmarkEnd w:id="0"/>
       <w:proofErr w:type="spellStart"/>
       <w:r>
         <w:t>Sharvil</w:t>
@@ -93,19 +91,7 @@
           <w:rPr>
             <w:rStyle w:val="Hyperlink"/>
           </w:rPr>
-          <w:t>https://github.com/TRX-1000/dynamic-firewa</w:t>
-        </w:r>
-        <w:r>
-          <w:rPr>
-            <w:rStyle w:val="Hyperlink"/>
-          </w:rPr>
-          <w:t>l</w:t>
-        </w:r>
-        <w:r>
-          <w:rPr>
-            <w:rStyle w:val="Hyperlink"/>
-          </w:rPr>
-          <w:t>l-security-logger.git</w:t>
+          <w:t>https://github.com/TRX-1000/dynamic-firewall-security-logger.git</w:t>
         </w:r>
       </w:hyperlink>
     </w:p>
@@ -119,18 +105,12 @@
     </w:p>
     <w:p>
       <w:r>
-        <w:t>Implement a TCP application integrated with a software-defined firewall and a centralized security event logger. The fire</w:t>
-      </w:r>
-      <w:r>
-        <w:t>wall permits configured TCP connections, detects repeated unauthorized connection attempts, temporarily blocks the offending source, and automatically restores access without affecting another client.</w:t>
-      </w:r>
-    </w:p>
-    <w:p>
-      <w:r>
-        <w:t>The policy counts three distinct unauthorized initial S</w:t>
-      </w:r>
-      <w:r>
-        <w:t>YN connections within a rolling 10-second window and requests a 10-second source block. Retransmissions of the same connection tuple are counted once. This is an educational single-switch IPv4/TCP implementation.</w:t>
+        <w:t>Implement a TCP application integrated with a software-defined firewall and a centralized security event logger. The firewall permits configured TCP connections, detects repeated unauthorized connection attempts, temporarily blocks the offending source, and automatically restores access without affecting another client.</w:t>
+      </w:r>
+    </w:p>
+    <w:p>
+      <w:r>
+        <w:t>The policy counts three distinct unauthorized initial SYN connections within a rolling 10-second window and requests a 10-second source block. Retransmissions of the same connection tuple are counted once. This is an educational single-switch IPv4/TCP implementation.</w:t>
       </w:r>
     </w:p>
     <w:p>
@@ -147,10 +127,7 @@
       </w:r>
       <w:proofErr w:type="spellStart"/>
       <w:r>
-        <w:t>Mini</w:t>
-      </w:r>
-      <w:r>
-        <w:t>net</w:t>
+        <w:t>Mininet</w:t>
       </w:r>
       <w:proofErr w:type="spellEnd"/>
       <w:r>
@@ -170,18 +147,12 @@
       </w:r>
       <w:proofErr w:type="spellEnd"/>
       <w:r>
-        <w:t xml:space="preserve"> 1.3 at 127.0.0.1:6653. A separate managemen</w:t>
-      </w:r>
-      <w:r>
-        <w:t>t link connects the controller namespace (192.168.100.1) to h4 (192.168.100.2), allowing security logging independently of the data-switch policy.</w:t>
-      </w:r>
-    </w:p>
-    <w:p>
-      <w:r>
-        <w:t>The application uses newline-framed TCP messages, a threaded echo server, and concurrent clients. The central</w:t>
-      </w:r>
-      <w:r>
-        <w:t xml:space="preserve"> logger appends JSONL records, flushes and </w:t>
+        <w:t xml:space="preserve"> 1.3 at 127.0.0.1:6653. A separate management link connects the controller namespace (192.168.100.1) to h4 (192.168.100.2), allowing security logging independently of the data-switch policy.</w:t>
+      </w:r>
+    </w:p>
+    <w:p>
+      <w:r>
+        <w:t xml:space="preserve">The application uses newline-framed TCP messages, a threaded echo server, and concurrent clients. The central logger appends JSONL records, flushes and </w:t>
       </w:r>
       <w:proofErr w:type="spellStart"/>
       <w:r>
@@ -194,13 +165,7 @@
     </w:p>
     <w:p>
       <w:r>
-        <w:t xml:space="preserve">Allowed </w:t>
-      </w:r>
-      <w:r>
-        <w:t>traffic is h1/h2 to h3 TCP 5000, and h3 to h4 TCP 7000 for application logging, with matching reply rules. TCP 9999 has a live test listener but is denied by the firewall. Other TCP connections are denied. ARP and ICMP are allowed for address resolution an</w:t>
-      </w:r>
-      <w:r>
-        <w:t>d diagnostics; unsupported protocols are dropped. Fixed ingress-port/IP checks constrain IPv4 source spoofing.</w:t>
+        <w:t>Allowed traffic is h1/h2 to h3 TCP 5000, and h3 to h4 TCP 7000 for application logging, with matching reply rules. TCP 9999 has a live test listener but is denied by the firewall. Other TCP connections are denied. ARP and ICMP are allowed for address resolution and diagnostics; unsupported protocols are dropped. Fixed ingress-port/IP checks constrain IPv4 source spoofing.</w:t>
       </w:r>
     </w:p>
     <w:p>
@@ -213,10 +178,7 @@
       </w:r>
       <w:proofErr w:type="spellEnd"/>
       <w:r>
-        <w:t>=10, overri</w:t>
-      </w:r>
-      <w:r>
-        <w:t xml:space="preserve">ding pre-existing allows. A barrier response confirms switch processing, while a </w:t>
+        <w:t xml:space="preserve">=10, overriding pre-existing allows. A barrier response confirms switch processing, while a </w:t>
       </w:r>
       <w:proofErr w:type="spellStart"/>
       <w:r>
@@ -224,10 +186,7 @@
       </w:r>
       <w:proofErr w:type="spellEnd"/>
       <w:r>
-        <w:t xml:space="preserve"> event records expiry. Controller restart clears the in-memory strike state. Policy persistence in the demo means forbidden traffic remains forbidden after temporar</w:t>
-      </w:r>
-      <w:r>
-        <w:t>y recovery, not persistence across controller restarts.</w:t>
+        <w:t xml:space="preserve"> event records expiry. Controller restart clears the in-memory strike state. Policy persistence in the demo means forbidden traffic remains forbidden after temporary recovery, not persistence across controller restarts.</w:t>
       </w:r>
     </w:p>
     <w:p>
@@ -256,10 +215,7 @@
       </w:r>
       <w:proofErr w:type="spellEnd"/>
       <w:r>
-        <w:t xml:space="preserve"> pa</w:t>
-      </w:r>
-      <w:r>
-        <w:t xml:space="preserve">ckage 2.3.0-1.1build1, Open </w:t>
+        <w:t xml:space="preserve"> package 2.3.0-1.1build1, Open </w:t>
       </w:r>
       <w:proofErr w:type="spellStart"/>
       <w:r>
@@ -272,10 +228,7 @@
     </w:p>
     <w:p>
       <w:r>
-        <w:t>OS-Ken uses the supplied controll</w:t>
-      </w:r>
-      <w:r>
-        <w:t>er_launcher.py and OSKEN_HUB_TYPE=</w:t>
+        <w:t>OS-Ken uses the supplied controller_launcher.py and OSKEN_HUB_TYPE=</w:t>
       </w:r>
       <w:proofErr w:type="spellStart"/>
       <w:r>
@@ -283,10 +236,7 @@
       </w:r>
       <w:proofErr w:type="spellEnd"/>
       <w:r>
-        <w:t>, rather than the original Ubuntu-22.04-only virtual-environment launcher. The user reported all 20 unit tests completed after applying the logging update; their full final test transcript is not in the archive. Th</w:t>
-      </w:r>
-      <w:r>
-        <w:t>e reviewed SDN evidence is suite 20261026-102714. Prior Mac/Windows proxy measurements are excluded from every SDN result in this report.</w:t>
+        <w:t>, rather than the original Ubuntu-22.04-only virtual-environment launcher. The user reported all 20 unit tests completed after applying the logging update; their full final test transcript is not in the archive. The reviewed SDN evidence is suite 20261026-102714. Prior Mac/Windows proxy measurements are excluded from every SDN result in this report.</w:t>
       </w:r>
     </w:p>
     <w:p>
@@ -299,17 +249,11 @@
     </w:p>
     <w:p>
       <w:r>
-        <w:t>The final suite completed its automated acceptance demo. Terminal evidence shows 0% ping loss (1</w:t>
-      </w:r>
-      <w:r>
-        <w:t xml:space="preserve">2/12 received) and successful concurrent-client operation. Saved demo records verify both clients can access the allowed service; </w:t>
+        <w:t xml:space="preserve">The final suite completed its automated acceptance demo. Terminal evidence shows 0% ping loss (12/12 received) and successful concurrent-client operation. Saved demo records verify both clients can access the allowed service; </w:t>
       </w:r>
       <w:r>
         <w:lastRenderedPageBreak/>
-        <w:t>three forbidden connections time out; h2 then cannot access the allowed port; h1 remains unaffected; h2 recovers automatically</w:t>
-      </w:r>
-      <w:r>
-        <w:t>; and the forbidden port remains denied afterward. A denied connection is checked as a timeout, not accepted merely because a listener refused it.</w:t>
+        <w:t>three forbidden connections time out; h2 then cannot access the allowed port; h1 remains unaffected; h2 recovers automatically; and the forbidden port remains denied afterward. A denied connection is checked as a timeout, not accepted merely because a listener refused it.</w:t>
       </w:r>
     </w:p>
     <w:tbl>
@@ -334,12 +278,6 @@
         <w:gridCol w:w="4680"/>
       </w:tblGrid>
       <w:tr>
-        <w:tblPrEx>
-          <w:tblCellMar>
-            <w:top w:w="0" w:type="dxa"/>
-            <w:bottom w:w="0" w:type="dxa"/>
-          </w:tblCellMar>
-        </w:tblPrEx>
         <w:trPr>
           <w:tblHeader/>
         </w:trPr>
@@ -367,12 +305,6 @@
         </w:tc>
       </w:tr>
       <w:tr>
-        <w:tblPrEx>
-          <w:tblCellMar>
-            <w:top w:w="0" w:type="dxa"/>
-            <w:bottom w:w="0" w:type="dxa"/>
-          </w:tblCellMar>
-        </w:tblPrEx>
         <w:tc>
           <w:tcPr>
             <w:tcW w:w="4680" w:type="dxa"/>
@@ -395,12 +327,6 @@
         </w:tc>
       </w:tr>
       <w:tr>
-        <w:tblPrEx>
-          <w:tblCellMar>
-            <w:top w:w="0" w:type="dxa"/>
-            <w:bottom w:w="0" w:type="dxa"/>
-          </w:tblCellMar>
-        </w:tblPrEx>
         <w:tc>
           <w:tcPr>
             <w:tcW w:w="4680" w:type="dxa"/>
@@ -423,12 +349,6 @@
         </w:tc>
       </w:tr>
       <w:tr>
-        <w:tblPrEx>
-          <w:tblCellMar>
-            <w:top w:w="0" w:type="dxa"/>
-            <w:bottom w:w="0" w:type="dxa"/>
-          </w:tblCellMar>
-        </w:tblPrEx>
         <w:tc>
           <w:tcPr>
             <w:tcW w:w="4680" w:type="dxa"/>
@@ -461,12 +381,6 @@
         </w:tc>
       </w:tr>
       <w:tr>
-        <w:tblPrEx>
-          <w:tblCellMar>
-            <w:top w:w="0" w:type="dxa"/>
-            <w:bottom w:w="0" w:type="dxa"/>
-          </w:tblCellMar>
-        </w:tblPrEx>
         <w:tc>
           <w:tcPr>
             <w:tcW w:w="4680" w:type="dxa"/>
@@ -489,12 +403,6 @@
         </w:tc>
       </w:tr>
       <w:tr>
-        <w:tblPrEx>
-          <w:tblCellMar>
-            <w:top w:w="0" w:type="dxa"/>
-            <w:bottom w:w="0" w:type="dxa"/>
-          </w:tblCellMar>
-        </w:tblPrEx>
         <w:tc>
           <w:tcPr>
             <w:tcW w:w="4680" w:type="dxa"/>
@@ -517,12 +425,6 @@
         </w:tc>
       </w:tr>
       <w:tr>
-        <w:tblPrEx>
-          <w:tblCellMar>
-            <w:top w:w="0" w:type="dxa"/>
-            <w:bottom w:w="0" w:type="dxa"/>
-          </w:tblCellMar>
-        </w:tblPrEx>
         <w:tc>
           <w:tcPr>
             <w:tcW w:w="4680" w:type="dxa"/>
@@ -547,10 +449,7 @@
     </w:tbl>
     <w:p>
       <w:r>
-        <w:t>The barrier measures switch processing, not the exact first dropped packet. The observed recovery time includes polling, scheduling and echo time. Switch timeout processing is not exact to the millisecond; the measured duration is reported rather than roun</w:t>
-      </w:r>
-      <w:r>
-        <w:t>ded into a claim of exactly 10 seconds. The packet count applies to this temporary rule, not all rejected traffic.</w:t>
+        <w:t>The barrier measures switch processing, not the exact first dropped packet. The observed recovery time includes polling, scheduling and echo time. Switch timeout processing is not exact to the millisecond; the measured duration is reported rather than rounded into a claim of exactly 10 seconds. The packet count applies to this temporary rule, not all rejected traffic.</w:t>
       </w:r>
     </w:p>
     <w:p>
@@ -563,10 +462,7 @@
     </w:p>
     <w:p>
       <w:r>
-        <w:t xml:space="preserve">The baseline uses the same controller, topology and services while bypassing TCP policy checks. Three rounds </w:t>
-      </w:r>
-      <w:r>
-        <w:t xml:space="preserve">alternate order: baseline/firewall, firewall/baseline, </w:t>
+        <w:t xml:space="preserve">The baseline uses the same controller, topology and services while bypassing TCP policy checks. Three rounds alternate order: baseline/firewall, firewall/baseline, </w:t>
       </w:r>
       <w:proofErr w:type="gramStart"/>
       <w:r>
@@ -574,10 +470,7 @@
       </w:r>
       <w:proofErr w:type="gramEnd"/>
       <w:r>
-        <w:t>/firewall. Each condition has 30 measured fresh TCP connections per round, after a discarded warm-up. Each sample exchanges 200 sequential messages of 4096 payload bytes. All 180 samples succee</w:t>
-      </w:r>
-      <w:r>
-        <w:t>ded (90 per condition).</w:t>
+        <w:t>/firewall. Each condition has 30 measured fresh TCP connections per round, after a discarded warm-up. Each sample exchanges 200 sequential messages of 4096 payload bytes. All 180 samples succeeded (90 per condition).</w:t>
       </w:r>
     </w:p>
     <w:p>
@@ -587,10 +480,7 @@
       </w:r>
       <w:proofErr w:type="spellEnd"/>
       <w:r>
-        <w:t xml:space="preserve"> is outgoing application payload divided by echo-loop time; it is not link capacity. Connection time includes handshake and initial flow setup. First echo includes server connection logging; steady echo median excludes the fi</w:t>
-      </w:r>
-      <w:r>
-        <w:t>rst exchange. The aggregate comparison is the median of three per-round medians, not a pooled mean.</w:t>
+        <w:t xml:space="preserve"> is outgoing application payload divided by echo-loop time; it is not link capacity. Connection time includes handshake and initial flow setup. First echo includes server connection logging; steady echo median excludes the first exchange. The aggregate comparison is the median of three per-round medians, not a pooled mean.</w:t>
       </w:r>
     </w:p>
     <w:tbl>
@@ -621,12 +511,6 @@
         <w:gridCol w:w="1560"/>
       </w:tblGrid>
       <w:tr>
-        <w:tblPrEx>
-          <w:tblCellMar>
-            <w:top w:w="0" w:type="dxa"/>
-            <w:bottom w:w="0" w:type="dxa"/>
-          </w:tblCellMar>
-        </w:tblPrEx>
         <w:trPr>
           <w:tblHeader/>
         </w:trPr>
@@ -723,12 +607,6 @@
         </w:tc>
       </w:tr>
       <w:tr>
-        <w:tblPrEx>
-          <w:tblCellMar>
-            <w:top w:w="0" w:type="dxa"/>
-            <w:bottom w:w="0" w:type="dxa"/>
-          </w:tblCellMar>
-        </w:tblPrEx>
         <w:tc>
           <w:tcPr>
             <w:tcW w:w="1560" w:type="dxa"/>
@@ -793,12 +671,6 @@
         </w:tc>
       </w:tr>
       <w:tr>
-        <w:tblPrEx>
-          <w:tblCellMar>
-            <w:top w:w="0" w:type="dxa"/>
-            <w:bottom w:w="0" w:type="dxa"/>
-          </w:tblCellMar>
-        </w:tblPrEx>
         <w:tc>
           <w:tcPr>
             <w:tcW w:w="1560" w:type="dxa"/>
@@ -863,12 +735,6 @@
         </w:tc>
       </w:tr>
       <w:tr>
-        <w:tblPrEx>
-          <w:tblCellMar>
-            <w:top w:w="0" w:type="dxa"/>
-            <w:bottom w:w="0" w:type="dxa"/>
-          </w:tblCellMar>
-        </w:tblPrEx>
         <w:tc>
           <w:tcPr>
             <w:tcW w:w="1560" w:type="dxa"/>
@@ -933,12 +799,6 @@
         </w:tc>
       </w:tr>
       <w:tr>
-        <w:tblPrEx>
-          <w:tblCellMar>
-            <w:top w:w="0" w:type="dxa"/>
-            <w:bottom w:w="0" w:type="dxa"/>
-          </w:tblCellMar>
-        </w:tblPrEx>
         <w:tc>
           <w:tcPr>
             <w:tcW w:w="1560" w:type="dxa"/>
@@ -1003,12 +863,6 @@
         </w:tc>
       </w:tr>
       <w:tr>
-        <w:tblPrEx>
-          <w:tblCellMar>
-            <w:top w:w="0" w:type="dxa"/>
-            <w:bottom w:w="0" w:type="dxa"/>
-          </w:tblCellMar>
-        </w:tblPrEx>
         <w:tc>
           <w:tcPr>
             <w:tcW w:w="1560" w:type="dxa"/>
@@ -1073,12 +927,6 @@
         </w:tc>
       </w:tr>
       <w:tr>
-        <w:tblPrEx>
-          <w:tblCellMar>
-            <w:top w:w="0" w:type="dxa"/>
-            <w:bottom w:w="0" w:type="dxa"/>
-          </w:tblCellMar>
-        </w:tblPrEx>
         <w:tc>
           <w:tcPr>
             <w:tcW w:w="1560" w:type="dxa"/>
@@ -1143,12 +991,6 @@
         </w:tc>
       </w:tr>
       <w:tr>
-        <w:tblPrEx>
-          <w:tblCellMar>
-            <w:top w:w="0" w:type="dxa"/>
-            <w:bottom w:w="0" w:type="dxa"/>
-          </w:tblCellMar>
-        </w:tblPrEx>
         <w:trPr>
           <w:tblHeader/>
         </w:trPr>
@@ -1202,12 +1044,6 @@
         </w:tc>
       </w:tr>
       <w:tr>
-        <w:tblPrEx>
-          <w:tblCellMar>
-            <w:top w:w="0" w:type="dxa"/>
-            <w:bottom w:w="0" w:type="dxa"/>
-          </w:tblCellMar>
-        </w:tblPrEx>
         <w:tc>
           <w:tcPr>
             <w:tcW w:w="2340" w:type="dxa"/>
@@ -1262,12 +1098,6 @@
         </w:tc>
       </w:tr>
       <w:tr>
-        <w:tblPrEx>
-          <w:tblCellMar>
-            <w:top w:w="0" w:type="dxa"/>
-            <w:bottom w:w="0" w:type="dxa"/>
-          </w:tblCellMar>
-        </w:tblPrEx>
         <w:tc>
           <w:tcPr>
             <w:tcW w:w="2340" w:type="dxa"/>
@@ -1322,12 +1152,6 @@
         </w:tc>
       </w:tr>
       <w:tr>
-        <w:tblPrEx>
-          <w:tblCellMar>
-            <w:top w:w="0" w:type="dxa"/>
-            <w:bottom w:w="0" w:type="dxa"/>
-          </w:tblCellMar>
-        </w:tblPrEx>
         <w:tc>
           <w:tcPr>
             <w:tcW w:w="2340" w:type="dxa"/>
@@ -1382,12 +1206,6 @@
         </w:tc>
       </w:tr>
       <w:tr>
-        <w:tblPrEx>
-          <w:tblCellMar>
-            <w:top w:w="0" w:type="dxa"/>
-            <w:bottom w:w="0" w:type="dxa"/>
-          </w:tblCellMar>
-        </w:tblPrEx>
         <w:tc>
           <w:tcPr>
             <w:tcW w:w="2340" w:type="dxa"/>
@@ -1452,10 +1270,7 @@
       </w:r>
       <w:proofErr w:type="spellEnd"/>
       <w:r>
-        <w:t xml:space="preserve"> was higher in the first two rounds and lower in the third. These mixed results and the variation between runs do not establish that filtering improves throughput. VM scheduling, storage synchronization</w:t>
-      </w:r>
-      <w:r>
-        <w:t xml:space="preserve"> and logging timeouts affect measurement; no statistical-significance claim is made. The earlier run's 5.3% decrease is not the final result and is not combined with this corrected run.</w:t>
+        <w:t xml:space="preserve"> was higher in the first two rounds and lower in the third. These mixed results and the variation between runs do not establish that filtering improves throughput. VM scheduling, storage synchronization and logging timeouts affect measurement; no statistical-significance claim is made. The earlier run's 5.3% decrease is not the final result and is not combined with this corrected run.</w:t>
       </w:r>
     </w:p>
     <w:p>
@@ -1468,10 +1283,7 @@
     </w:p>
     <w:p>
       <w:r>
-        <w:t>The earlier topology started the switch before the logger and stopped the logger before pending events had drained. The revised topology starts the logger before switch connection, requires central SWITCH_READY, waits for all newly recorded controller even</w:t>
-      </w:r>
-      <w:r>
-        <w:t xml:space="preserve">t IDs and server disconnects to appear centrally, and requires a one-second quiet </w:t>
+        <w:t xml:space="preserve">The earlier topology started the switch before the logger and stopped the logger before pending events had drained. The revised topology starts the logger before switch connection, requires central SWITCH_READY, waits for all newly recorded controller event IDs and server disconnects to appear centrally, and requires a one-second quiet </w:t>
       </w:r>
       <w:r>
         <w:lastRenderedPageBreak/>
@@ -1484,10 +1296,7 @@
       </w:r>
       <w:proofErr w:type="spellStart"/>
       <w:r>
-        <w:t>valida</w:t>
-      </w:r>
-      <w:r>
-        <w:t>tion.json</w:t>
+        <w:t>validation.json</w:t>
       </w:r>
       <w:proofErr w:type="spellEnd"/>
       <w:r>
@@ -1499,10 +1308,7 @@
       </w:r>
       <w:proofErr w:type="spellEnd"/>
       <w:r>
-        <w:t xml:space="preserve"> errors</w:t>
-      </w:r>
-      <w:r>
-        <w:t xml:space="preserve"> or controller </w:t>
+        <w:t xml:space="preserve"> errors or controller </w:t>
       </w:r>
       <w:proofErr w:type="spellStart"/>
       <w:r>
@@ -1515,10 +1321,7 @@
     </w:p>
     <w:p>
       <w:r>
-        <w:t>Fourteen LOGGER_UNAVAILABLE timeout warnings remain: seven controller and seven application-server warnings. Every affected event ID is present centrally. Thus persistence succeeded for these observe</w:t>
-      </w:r>
-      <w:r>
-        <w:t xml:space="preserve">d events, but the sender did not obtain a timely acknowledgement within its 0.3-second timeout. These are real acknowledgement failures and can affect timings; the submission must not claim warning-free or exactly-once delivery. The </w:t>
+        <w:t xml:space="preserve">Fourteen LOGGER_UNAVAILABLE timeout warnings remain: seven controller and seven application-server warnings. Every affected event ID is present centrally. Thus persistence succeeded for these observed events, but the sender did not obtain a timely acknowledgement within its 0.3-second timeout. These are real acknowledgement failures and can affect timings; the submission must not claim warning-free or exactly-once delivery. The </w:t>
       </w:r>
       <w:proofErr w:type="spellStart"/>
       <w:r>
@@ -1526,10 +1329,7 @@
       </w:r>
       <w:proofErr w:type="spellEnd"/>
       <w:r>
-        <w:t xml:space="preserve"> deprecation an</w:t>
-      </w:r>
-      <w:r>
-        <w:t xml:space="preserve">d </w:t>
+        <w:t xml:space="preserve"> deprecation and </w:t>
       </w:r>
       <w:proofErr w:type="spellStart"/>
       <w:r>
@@ -1550,13 +1350,7 @@
     </w:p>
     <w:p>
       <w:r>
-        <w:t>The topology is fixed, with on</w:t>
-      </w:r>
-      <w:r>
-        <w:t>e switch and IPv4/TCP policy. It does not implement general routing, NAT, TLS inspection, authenticated ARP, full TCP state tracking, or fragment reassembly. The block filters outgoing IPv4 from one source, not bidirectional quarantine. ARP is still permit</w:t>
-      </w:r>
-      <w:r>
-        <w:t>ted. Logs have no authentication, TLS or rotation. Controller queuing is bounded and has no automatic replay. A passing run demonstrates the tested scenario, not production security or universal delivery guarantees.</w:t>
+        <w:t>The topology is fixed, with one switch and IPv4/TCP policy. It does not implement general routing, NAT, TLS inspection, authenticated ARP, full TCP state tracking, or fragment reassembly. The block filters outgoing IPv4 from one source, not bidirectional quarantine. ARP is still permitted. Logs have no authentication, TLS or rotation. Controller queuing is bounded and has no automatic replay. A passing run demonstrates the tested scenario, not production security or universal delivery guarantees.</w:t>
       </w:r>
     </w:p>
     <w:p>
@@ -1569,10 +1363,7 @@
     </w:p>
     <w:p>
       <w:r>
-        <w:t>The implementation demonst</w:t>
-      </w:r>
-      <w:r>
-        <w:t>rated dynamic allow/deny rules, threshold-based blocking, client isolation, automatic recovery and centralized event persistence on an actual Ubuntu/</w:t>
+        <w:t>The implementation demonstrated dynamic allow/deny rules, threshold-based blocking, client isolation, automatic recovery and centralized event persistence on an actual Ubuntu/</w:t>
       </w:r>
       <w:proofErr w:type="spellStart"/>
       <w:r>
@@ -1588,10 +1379,7 @@
       </w:r>
       <w:proofErr w:type="spellEnd"/>
       <w:r>
-        <w:t xml:space="preserve"> deployment. The final run completed 180 successful benchmark samples and preserved all obs</w:t>
-      </w:r>
-      <w:r>
-        <w:t>erved controller events centrally. Performance values are reported as measurements under the tested VM conditions, with acknowledgement timeouts and dependency warnings disclosed.</w:t>
+        <w:t xml:space="preserve"> deployment. The final run completed 180 successful benchmark samples and preserved all observed controller events centrally. Performance values are reported as measurements under the tested VM conditions, with acknowledgement timeouts and dependency warnings disclosed.</w:t>
       </w:r>
     </w:p>
     <w:p>
@@ -1652,10 +1440,7 @@
       </w:r>
       <w:proofErr w:type="spellEnd"/>
       <w:r>
-        <w:t xml:space="preserve"> a</w:t>
-      </w:r>
-      <w:r>
-        <w:t xml:space="preserve">nd *-controller.log files provide local event and warning evidence. </w:t>
+        <w:t xml:space="preserve"> and *-controller.log files provide local event and warning evidence. </w:t>
       </w:r>
       <w:proofErr w:type="spellStart"/>
       <w:r>
@@ -1667,15 +1452,8 @@
       </w:r>
     </w:p>
     <w:p>
-      <w:r>
-        <w:t>Add the team details and repository link above befor</w:t>
-      </w:r>
-      <w:r>
-        <w:t xml:space="preserve">e submission. If the course separately requires a flow-table screenshot, VM resource inventory or repository publication, those items are not demonstrated by this archive. The supplied rubric checklist references such requirements, but the original rubric </w:t>
-      </w:r>
-      <w:r>
-        <w:t>PDF was not independently available for this review.</w:t>
-      </w:r>
+      <w:bookmarkStart w:id="0" w:name="_GoBack"/>
+      <w:bookmarkEnd w:id="0"/>
     </w:p>
     <w:sectPr>
       <w:pgSz w:w="11906" w:h="16838"/>

</xml_diff>